<commit_message>
Update Isoluz Growth to GT-only pricing and export PDF.
Sets Assessoria de Growth to 12x R$ 2.569,91 (GT only), keeps EC and e-commerce values, and publishes an updated PDF.

Co-authored-by: sarapizzico-hue <sarapizzico-hue@users.noreply.github.com>
</commit_message>
<xml_diff>
--- a/proposta-isoluz.docx
+++ b/proposta-isoluz.docx
@@ -140,7 +140,7 @@
           <w:color w:val="1E1E1E"/>
           <w:sz w:val="22"/>
         </w:rPr>
-        <w:t>03 · Assessoria de Growth —</w:t>
+        <w:t>03 · Assessoria de Growth — Gestor de Tráfego (GT) operando aquisição com método.</w:t>
       </w:r>
       <w:r>
         <w:rPr>
@@ -149,7 +149,6 @@
           <w:color w:val="5A5A5A"/>
           <w:sz w:val="22"/>
         </w:rPr>
-        <w:t xml:space="preserve"> Account + GT + Copy + Design operando aquisição com método.</w:t>
       </w:r>
     </w:p>
     <w:p>
@@ -1066,7 +1065,7 @@
           <w:color w:val="E50914"/>
           <w:sz w:val="28"/>
         </w:rPr>
-        <w:t>Account + GT + Copy + Design</w:t>
+        <w:t>Gestor de Tráfego (GT)</w:t>
       </w:r>
     </w:p>
     <w:p>
@@ -1719,7 +1718,9 @@
             <w:tcW w:type="dxa" w:w="4986"/>
           </w:tcPr>
           <w:p>
-            <w:r/>
+            <w:r>
+              <w:t>R$ 9.000 a R$ 14.000</w:t>
+            </w:r>
             <w:r>
               <w:rPr>
                 <w:rFonts w:ascii="Calibri" w:hAnsi="Calibri" w:eastAsia="Calibri"/>
@@ -1727,7 +1728,6 @@
                 <w:color w:val="1E1E1E"/>
                 <w:sz w:val="20"/>
               </w:rPr>
-              <w:t>R$ 30.000 a R$ 43.000</w:t>
             </w:r>
           </w:p>
         </w:tc>
@@ -2007,7 +2007,9 @@
             <w:tcW w:type="dxa" w:w="3324"/>
           </w:tcPr>
           <w:p>
-            <w:r/>
+            <w:r>
+              <w:t>12× R$ 2.569,91</w:t>
+            </w:r>
             <w:r>
               <w:rPr>
                 <w:rFonts w:ascii="Calibri" w:hAnsi="Calibri" w:eastAsia="Calibri"/>
@@ -2015,7 +2017,6 @@
                 <w:color w:val="1E1E1E"/>
                 <w:sz w:val="20"/>
               </w:rPr>
-              <w:t>12× R$ 6.172,87</w:t>
             </w:r>
           </w:p>
         </w:tc>
@@ -2024,7 +2025,9 @@
             <w:tcW w:type="dxa" w:w="3324"/>
           </w:tcPr>
           <w:p>
-            <w:r/>
+            <w:r>
+              <w:t>Gestor de Tráfego (GT)</w:t>
+            </w:r>
             <w:r>
               <w:rPr>
                 <w:rFonts w:ascii="Calibri" w:hAnsi="Calibri" w:eastAsia="Calibri"/>
@@ -2032,7 +2035,6 @@
                 <w:color w:val="1E1E1E"/>
                 <w:sz w:val="20"/>
               </w:rPr>
-              <w:t>Account + GT + Copy + Design</w:t>
             </w:r>
           </w:p>
         </w:tc>
@@ -2060,7 +2062,9 @@
             <w:tcW w:type="dxa" w:w="3324"/>
           </w:tcPr>
           <w:p>
-            <w:r/>
+            <w:r>
+              <w:t>~ R$ 3.863,77 /mês</w:t>
+            </w:r>
             <w:r>
               <w:rPr>
                 <w:rFonts w:ascii="Calibri" w:hAnsi="Calibri" w:eastAsia="Calibri"/>
@@ -2068,7 +2072,6 @@
                 <w:color w:val="1E1E1E"/>
                 <w:sz w:val="20"/>
               </w:rPr>
-              <w:t>~ R$ 7.466,73 /mês</w:t>
             </w:r>
           </w:p>
         </w:tc>
@@ -2289,7 +2292,9 @@
             <w:tcW w:type="dxa" w:w="4986"/>
           </w:tcPr>
           <w:p>
-            <w:r/>
+            <w:r>
+              <w:t>R$ 2.570</w:t>
+            </w:r>
             <w:r>
               <w:rPr>
                 <w:rFonts w:ascii="Calibri" w:hAnsi="Calibri" w:eastAsia="Calibri"/>
@@ -2297,7 +2302,6 @@
                 <w:color w:val="1E1E1E"/>
                 <w:sz w:val="20"/>
               </w:rPr>
-              <w:t>R$ 6.173</w:t>
             </w:r>
           </w:p>
         </w:tc>
@@ -2328,7 +2332,9 @@
             <w:tcW w:type="dxa" w:w="4986"/>
           </w:tcPr>
           <w:p>
-            <w:r/>
+            <w:r>
+              <w:t>R$ 3.864</w:t>
+            </w:r>
             <w:r>
               <w:rPr>
                 <w:rFonts w:ascii="Calibri" w:hAnsi="Calibri" w:eastAsia="Calibri"/>
@@ -2336,7 +2342,6 @@
                 <w:color w:val="1E1E1E"/>
                 <w:sz w:val="20"/>
               </w:rPr>
-              <w:t>R$ 7.467</w:t>
             </w:r>
           </w:p>
         </w:tc>

</xml_diff>

<commit_message>
Remove Isoluz breakeven slide and refresh PDF.
Drops the 3–4 month equilibrium closing slide and renumbers the deck to 7 pages.

Co-authored-by: sarapizzico-hue <sarapizzico-hue@users.noreply.github.com>
</commit_message>
<xml_diff>
--- a/proposta-isoluz.docx
+++ b/proposta-isoluz.docx
@@ -2105,301 +2105,6 @@
     </w:p>
     <w:p>
       <w:pPr>
-        <w:spacing w:after="40" w:before="0"/>
-      </w:pPr>
-      <w:r>
-        <w:rPr>
-          <w:rFonts w:ascii="Calibri" w:hAnsi="Calibri" w:eastAsia="Calibri"/>
-          <w:b/>
-          <w:color w:val="E50914"/>
-          <w:sz w:val="20"/>
-        </w:rPr>
-        <w:t>LEITURA DE RETORNO · PLANO DE 12 MESES</w:t>
-      </w:r>
-    </w:p>
-    <w:p>
-      <w:pPr>
-        <w:spacing w:after="160" w:before="40"/>
-      </w:pPr>
-      <w:r>
-        <w:rPr>
-          <w:rFonts w:ascii="Calibri" w:hAnsi="Calibri" w:eastAsia="Calibri"/>
-          <w:b/>
-          <w:color w:val="E50914"/>
-          <w:sz w:val="28"/>
-        </w:rPr>
-        <w:t>Equilíbrio estimado em cerca de 3 a 4 meses</w:t>
-      </w:r>
-    </w:p>
-    <w:p>
-      <w:pPr>
-        <w:spacing w:after="120" w:before="0"/>
-      </w:pPr>
-      <w:r>
-        <w:rPr>
-          <w:rFonts w:ascii="Calibri" w:hAnsi="Calibri" w:eastAsia="Calibri"/>
-          <w:b w:val="0"/>
-          <w:color w:val="1E1E1E"/>
-          <w:sz w:val="22"/>
-        </w:rPr>
-        <w:t>Cenário de referência com base no faturamento atual (~R$ 120 mil) e margem de contribuição saudável da Isoluz.</w:t>
-      </w:r>
-    </w:p>
-    <w:tbl>
-      <w:tblPr>
-        <w:tblStyle w:val="TableGrid"/>
-        <w:tblW w:type="auto" w:w="0"/>
-        <w:tblLook w:firstColumn="1" w:firstRow="1" w:lastColumn="0" w:lastRow="0" w:noHBand="0" w:noVBand="1" w:val="04A0"/>
-      </w:tblPr>
-      <w:tblGrid>
-        <w:gridCol w:w="4986"/>
-        <w:gridCol w:w="4986"/>
-      </w:tblGrid>
-      <w:tr>
-        <w:tc>
-          <w:tcPr>
-            <w:tcW w:type="dxa" w:w="4986"/>
-          </w:tcPr>
-          <w:p>
-            <w:pPr>
-              <w:shd w:fill="FCE8E9" w:val="clear"/>
-            </w:pPr>
-            <w:r/>
-            <w:r>
-              <w:rPr>
-                <w:rFonts w:ascii="Calibri" w:hAnsi="Calibri" w:eastAsia="Calibri"/>
-                <w:b/>
-                <w:color w:val="E50914"/>
-                <w:sz w:val="20"/>
-              </w:rPr>
-              <w:t>Investimento mensal V4</w:t>
-            </w:r>
-          </w:p>
-        </w:tc>
-        <w:tc>
-          <w:tcPr>
-            <w:tcW w:type="dxa" w:w="4986"/>
-          </w:tcPr>
-          <w:p>
-            <w:pPr>
-              <w:shd w:fill="FCE8E9" w:val="clear"/>
-            </w:pPr>
-            <w:r/>
-            <w:r>
-              <w:rPr>
-                <w:rFonts w:ascii="Calibri" w:hAnsi="Calibri" w:eastAsia="Calibri"/>
-                <w:b/>
-                <w:color w:val="E50914"/>
-                <w:sz w:val="20"/>
-              </w:rPr>
-              <w:t>Valor</w:t>
-            </w:r>
-          </w:p>
-        </w:tc>
-      </w:tr>
-      <w:tr>
-        <w:tc>
-          <w:tcPr>
-            <w:tcW w:type="dxa" w:w="4986"/>
-          </w:tcPr>
-          <w:p>
-            <w:r/>
-            <w:r>
-              <w:rPr>
-                <w:rFonts w:ascii="Calibri" w:hAnsi="Calibri" w:eastAsia="Calibri"/>
-                <w:b w:val="0"/>
-                <w:color w:val="1E1E1E"/>
-                <w:sz w:val="20"/>
-              </w:rPr>
-              <w:t>Estruturação Comercial</w:t>
-            </w:r>
-          </w:p>
-        </w:tc>
-        <w:tc>
-          <w:tcPr>
-            <w:tcW w:type="dxa" w:w="4986"/>
-          </w:tcPr>
-          <w:p>
-            <w:r/>
-            <w:r>
-              <w:rPr>
-                <w:rFonts w:ascii="Calibri" w:hAnsi="Calibri" w:eastAsia="Calibri"/>
-                <w:b w:val="0"/>
-                <w:color w:val="1E1E1E"/>
-                <w:sz w:val="20"/>
-              </w:rPr>
-              <w:t>R$ 961</w:t>
-            </w:r>
-          </w:p>
-        </w:tc>
-      </w:tr>
-      <w:tr>
-        <w:tc>
-          <w:tcPr>
-            <w:tcW w:type="dxa" w:w="4986"/>
-          </w:tcPr>
-          <w:p>
-            <w:r/>
-            <w:r>
-              <w:rPr>
-                <w:rFonts w:ascii="Calibri" w:hAnsi="Calibri" w:eastAsia="Calibri"/>
-                <w:b w:val="0"/>
-                <w:color w:val="1E1E1E"/>
-                <w:sz w:val="20"/>
-              </w:rPr>
-              <w:t>E-commerce B2B</w:t>
-            </w:r>
-          </w:p>
-        </w:tc>
-        <w:tc>
-          <w:tcPr>
-            <w:tcW w:type="dxa" w:w="4986"/>
-          </w:tcPr>
-          <w:p>
-            <w:r/>
-            <w:r>
-              <w:rPr>
-                <w:rFonts w:ascii="Calibri" w:hAnsi="Calibri" w:eastAsia="Calibri"/>
-                <w:b w:val="0"/>
-                <w:color w:val="1E1E1E"/>
-                <w:sz w:val="20"/>
-              </w:rPr>
-              <w:t>R$ 333</w:t>
-            </w:r>
-          </w:p>
-        </w:tc>
-      </w:tr>
-      <w:tr>
-        <w:tc>
-          <w:tcPr>
-            <w:tcW w:type="dxa" w:w="4986"/>
-          </w:tcPr>
-          <w:p>
-            <w:r/>
-            <w:r>
-              <w:rPr>
-                <w:rFonts w:ascii="Calibri" w:hAnsi="Calibri" w:eastAsia="Calibri"/>
-                <w:b w:val="0"/>
-                <w:color w:val="1E1E1E"/>
-                <w:sz w:val="20"/>
-              </w:rPr>
-              <w:t>Assessoria de Growth</w:t>
-            </w:r>
-          </w:p>
-        </w:tc>
-        <w:tc>
-          <w:tcPr>
-            <w:tcW w:type="dxa" w:w="4986"/>
-          </w:tcPr>
-          <w:p>
-            <w:r>
-              <w:t>R$ 2.570</w:t>
-            </w:r>
-            <w:r>
-              <w:rPr>
-                <w:rFonts w:ascii="Calibri" w:hAnsi="Calibri" w:eastAsia="Calibri"/>
-                <w:b w:val="0"/>
-                <w:color w:val="1E1E1E"/>
-                <w:sz w:val="20"/>
-              </w:rPr>
-            </w:r>
-          </w:p>
-        </w:tc>
-      </w:tr>
-      <w:tr>
-        <w:tc>
-          <w:tcPr>
-            <w:tcW w:type="dxa" w:w="4986"/>
-          </w:tcPr>
-          <w:p>
-            <w:pPr>
-              <w:shd w:fill="FFF8E7" w:val="clear"/>
-            </w:pPr>
-            <w:r/>
-            <w:r>
-              <w:rPr>
-                <w:rFonts w:ascii="Calibri" w:hAnsi="Calibri" w:eastAsia="Calibri"/>
-                <w:b/>
-                <w:color w:val="1E1E1E"/>
-                <w:sz w:val="20"/>
-              </w:rPr>
-              <w:t>Total mensal V4</w:t>
-            </w:r>
-          </w:p>
-        </w:tc>
-        <w:tc>
-          <w:tcPr>
-            <w:tcW w:type="dxa" w:w="4986"/>
-          </w:tcPr>
-          <w:p>
-            <w:r>
-              <w:t>R$ 3.864</w:t>
-            </w:r>
-            <w:r>
-              <w:rPr>
-                <w:rFonts w:ascii="Calibri" w:hAnsi="Calibri" w:eastAsia="Calibri"/>
-                <w:b w:val="0"/>
-                <w:color w:val="1E1E1E"/>
-                <w:sz w:val="20"/>
-              </w:rPr>
-            </w:r>
-          </w:p>
-        </w:tc>
-      </w:tr>
-    </w:tbl>
-    <w:p/>
-    <w:p>
-      <w:pPr>
-        <w:spacing w:after="120" w:before="0"/>
-      </w:pPr>
-      <w:r>
-        <w:rPr>
-          <w:rFonts w:ascii="Calibri" w:hAnsi="Calibri" w:eastAsia="Calibri"/>
-          <w:b/>
-          <w:color w:val="1E1E1E"/>
-          <w:sz w:val="22"/>
-        </w:rPr>
-        <w:t>O que buscamos: controle — comercial organizado, vitrine B2B no ar e crescimento regional sem engasgar a entrega.</w:t>
-      </w:r>
-    </w:p>
-    <w:p>
-      <w:pPr>
-        <w:spacing w:after="120" w:before="120"/>
-      </w:pPr>
-      <w:r>
-        <w:rPr>
-          <w:rFonts w:ascii="Calibri" w:hAnsi="Calibri" w:eastAsia="Calibri"/>
-          <w:b w:val="0"/>
-          <w:color w:val="5A5A5A"/>
-          <w:sz w:val="20"/>
-        </w:rPr>
-        <w:t>Importante: esta não é garantia de resultado. É uma referência para acompanhar indicadores reais da Isoluz (ticket, conversão, capacidade mensal e CAC) e ajustar o ritmo com segurança.</w:t>
-      </w:r>
-    </w:p>
-    <w:p>
-      <w:pPr>
-        <w:spacing w:before="80" w:after="160"/>
-        <w:pBdr>
-          <w:bottom w:val="single" w:sz="12" w:space="1" w:color="E50914"/>
-        </w:pBdr>
-      </w:pPr>
-    </w:p>
-    <w:p>
-      <w:pPr>
-        <w:spacing w:after="120" w:before="0"/>
-      </w:pPr>
-      <w:r>
-        <w:rPr>
-          <w:rFonts w:ascii="Calibri" w:hAnsi="Calibri" w:eastAsia="Calibri"/>
-          <w:b/>
-          <w:color w:val="E50914"/>
-          <w:sz w:val="22"/>
-        </w:rPr>
-        <w:t>Próximo passo: formalizar EC + E-com + Assessoria</w:t>
-      </w:r>
-    </w:p>
-    <w:p>
-      <w:pPr>
         <w:spacing w:after="120" w:before="200"/>
       </w:pPr>
       <w:r>

</xml_diff>